<commit_message>
docs: 638 tests passants, vigilance réactivée (26 DAGs actifs + 2 pausés)
- Présentation et doc Bloc 4 : 638 tests passent, 0 échec ; 26 actifs +
  2 pausés ; ligne vigilance de l'annexe DAG, frise horaire et diagramme 04
  mis à jour.
- AGENTS.md : retrait de « test_error_display 3 failures » (faux), commande
  pytest fiable (doublons iCloud), note vigilance, mypy en cours.
- CHANGELOG : vigilance et tests dans la section Sprint 26.
</commit_message>
<xml_diff>
--- a/présentation/DOCUMENTATION_BLOC4_LyonFlow.docx
+++ b/présentation/DOCUMENTATION_BLOC4_LyonFlow.docx
@@ -701,7 +701,7 @@
               <w:t xml:space="preserve">28</w:t>
             </w:r>
             <w:r>
-              <w:t xml:space="preserve"> (25 actifs + 3 pausés intentionnels)</w:t>
+              <w:t xml:space="preserve"> (26 actifs + 2 pausés intentionnels)</w:t>
             </w:r>
           </w:p>
         </w:tc>
@@ -969,7 +969,7 @@
               <w:jc w:val="right"/>
             </w:pPr>
             <w:r>
-              <w:t xml:space="preserve">631 tests passent, 3 échecs connus (55 fichiers </w:t>
+              <w:t xml:space="preserve">638 tests passent, 0 échec (55 fichiers </w:t>
             </w:r>
             <w:r>
               <w:rPr>
@@ -1363,7 +1363,7 @@
         <w:t xml:space="preserve">02_infra_vps</w:t>
       </w:r>
       <w:r>
-        <w:t xml:space="preserve"> montrent désormais le monitoring réel (cron + alertes Telegram), Prometheus / Grafana / Alertmanager étant marqués comme cible non déployée, ainsi que le backup offsite Google Drive opérationnel ; 04_pipeline_airflow reprend les horaires et le décompte des DAGs au 2026-09-24 (25 actifs, 3 pausés). Le reste du contenu (schéma des 60+ tables, 4 piliers ML, pipeline des 28 DAGs, routing pgRouting) est cohérent avec le code au 2026-07-10.</w:t>
+        <w:t xml:space="preserve"> montrent désormais le monitoring réel (cron + alertes Telegram), Prometheus / Grafana / Alertmanager étant marqués comme cible non déployée, ainsi que le backup offsite Google Drive opérationnel ; 04_pipeline_airflow reprend les horaires et le décompte des DAGs au 2026-09-24 (26 actifs, 2 pausés). Le reste du contenu (schéma des 60+ tables, 4 piliers ML, pipeline des 28 DAGs, routing pgRouting) est cohérent avec le code au 2026-07-10.</w:t>
       </w:r>
     </w:p>
     <w:p>
@@ -3375,7 +3375,7 @@
         <w:t xml:space="preserve">28 DAGs</w:t>
       </w:r>
       <w:r>
-        <w:t xml:space="preserve"> (25 actifs + 3 pausés intentionnels). Le détail exhaustif DAG par DAG (rôle, cadence, tables source/cible, dépendances) est en </w:t>
+        <w:t xml:space="preserve"> (26 actifs + 2 pausés intentionnels). Le détail exhaustif DAG par DAG (rôle, cadence, tables source/cible, dépendances) est en </w:t>
       </w:r>
       <w:r>
         <w:rPr>
@@ -7798,22 +7798,13 @@
         <w:t xml:space="preserve">retrain_xgboost_speed</w:t>
       </w:r>
       <w:r>
-        <w:t xml:space="preserve">, </w:t>
+        <w:t xml:space="preserve"> et </w:t>
       </w:r>
       <w:r>
         <w:rPr>
           <w:rStyle w:val="VerbatimChar"/>
         </w:rPr>
         <w:t xml:space="preserve">refresh_heavy_mv</w:t>
-      </w:r>
-      <w:r>
-        <w:t xml:space="preserve"> et </w:t>
-      </w:r>
-      <w:r>
-        <w:rPr>
-          <w:rStyle w:val="VerbatimChar"/>
-        </w:rPr>
-        <w:t xml:space="preserve">collect_vigilance_meteo</w:t>
       </w:r>
       <w:r>
         <w:t xml:space="preserve"> restent </w:t>
@@ -8326,10 +8317,10 @@
                 <w:b/>
                 <w:bCs/>
               </w:rPr>
-              <w:t xml:space="preserve">631 tests passent</w:t>
-            </w:r>
-            <w:r>
-              <w:t xml:space="preserve"> et 3 échouent (mesure du 2026-09-24, 55 fichiers </w:t>
+              <w:t xml:space="preserve">638 tests passent, 0 échec</w:t>
+            </w:r>
+            <w:r>
+              <w:t xml:space="preserve"> (mesure du 2026-09-24, 55 fichiers </w:t>
             </w:r>
             <w:r>
               <w:rPr>
@@ -8338,7 +8329,7 @@
               <w:t xml:space="preserve">test_*.py</w:t>
             </w:r>
             <w:r>
-              <w:t xml:space="preserve"> hors e2e) : 2 tests TomTom devenus obsolètes depuis le retrait de TomTom du cycle 5 min, et 1 test du sélecteur de carte Vélo’v. Correction en cours.</w:t>
+              <w:t xml:space="preserve"> hors e2e, e2e Playwright exécutés à part).</w:t>
             </w:r>
           </w:p>
         </w:tc>
@@ -9815,7 +9806,7 @@
         <w:t xml:space="preserve">28 DAGs Airflow</w:t>
       </w:r>
       <w:r>
-        <w:t xml:space="preserve"> du projet (25 actifs, 3 pausés intentionnels), vérifiés le 2026-09-24 par lecture directe du code source (</w:t>
+        <w:t xml:space="preserve"> du projet (26 actifs, 2 pausés intentionnels), vérifiés le 2026-09-24 par lecture directe du code source (</w:t>
       </w:r>
       <w:r>
         <w:rPr>
@@ -10228,7 +10219,16 @@
               <w:pStyle w:val="Compact"/>
             </w:pPr>
             <w:r>
-              <w:t xml:space="preserve">Vigilance canicule dept 69 (API Opendatasoft, migration_045). ⏸ Pausé — la collecte est assurée par </w:t>
+              <w:t xml:space="preserve">Vigilance canicule dept 69 (API Opendatasoft, migration_045). Seule collecte depuis le 2026-09-24 : </w:t>
+            </w:r>
+            <w:r>
+              <w:rPr>
+                <w:rStyle w:val="VerbatimChar"/>
+              </w:rPr>
+              <w:t xml:space="preserve">VigilanceMeteo</w:t>
+            </w:r>
+            <w:r>
+              <w:t xml:space="preserve"> a été retiré de </w:t>
             </w:r>
             <w:r>
               <w:rPr>
@@ -10237,16 +10237,16 @@
               <w:t xml:space="preserve">collect_bronze</w:t>
             </w:r>
             <w:r>
-              <w:t xml:space="preserve"> (</w:t>
-            </w:r>
-            <w:r>
-              <w:rPr>
-                <w:rStyle w:val="VerbatimChar"/>
-              </w:rPr>
-              <w:t xml:space="preserve">VigilanceMeteo</w:t>
-            </w:r>
-            <w:r>
-              <w:t xml:space="preserve"> dans ses collecteurs, */5 min) : ce DAG dédié est redondant.</w:t>
+              <w:t xml:space="preserve"> (288 appels/jour pour des bulletins mis à jour 2×/jour). Fraîcheur surveillée par </w:t>
+            </w:r>
+            <w:r>
+              <w:rPr>
+                <w:rStyle w:val="VerbatimChar"/>
+              </w:rPr>
+              <w:t xml:space="preserve">dag_critical_pipeline_health</w:t>
+            </w:r>
+            <w:r>
+              <w:t xml:space="preserve"> (alerte au-delà de 13 h).</w:t>
             </w:r>
           </w:p>
         </w:tc>
@@ -11967,7 +11967,7 @@
           <w:b/>
           <w:bCs/>
         </w:rPr>
-        <w:t xml:space="preserve">Total : 28 DAGs — 25 actifs + 3 pausés intentionnels</w:t>
+        <w:t xml:space="preserve">Total : 28 DAGs — 26 actifs + 2 pausés intentionnels</w:t>
       </w:r>
       <w:r>
         <w:t xml:space="preserve"> (</w:t>
@@ -11988,16 +11988,7 @@
         <w:t xml:space="preserve">retrain_xgboost_speed</w:t>
       </w:r>
       <w:r>
-        <w:t xml:space="preserve">, </w:t>
-      </w:r>
-      <w:r>
-        <w:rPr>
-          <w:rStyle w:val="VerbatimChar"/>
-        </w:rPr>
-        <w:t xml:space="preserve">collect_vigilance_meteo</w:t>
-      </w:r>
-      <w:r>
-        <w:t xml:space="preserve">), tous documentés ci-dessus avec leur raison de pause.</w:t>
+        <w:t xml:space="preserve">), tous deux documentés ci-dessus avec leur raison de pause.</w:t>
       </w:r>
     </w:p>
     <w:bookmarkEnd w:id="71"/>
@@ -12297,7 +12288,7 @@
         <w:t xml:space="preserve">*/6h       </w:t>
       </w:r>
       <w:r>
-        <w:t xml:space="preserve">collect_vigilance_meteo (pausé — collecte via collect_bronze)</w:t>
+        <w:t xml:space="preserve">collect_vigilance_meteo</w:t>
       </w:r>
     </w:p>
     <w:p>

</xml_diff>